<commit_message>
techpack: prevent tables and sections splitting across pages
- cantSplit on all 49 table rows: no row breaks mid-row
- keepNext on 11 dividers, 11 headings, 10 sub-headings, 9 pre-table paras
- labels PDF: neutral bg on transparent neck labels

Co-Authored-By: Claude Sonnet 4.6 <noreply@anthropic.com>
</commit_message>
<xml_diff>
--- a/SteelStag-ManufacturerPack-SS2026/01-TechPack/SteelStag-TechPack-SS2026.docx
+++ b/SteelStag-ManufacturerPack-SS2026/01-TechPack/SteelStag-TechPack-SS2026.docx
@@ -4,6 +4,7 @@
   <w:body>
     <w:p>
       <w:pPr>
+        <w:keepNext/>
         <w:spacing w:before="0" w:after="40"/>
       </w:pPr>
       <w:r>
@@ -29,6 +30,7 @@
     </w:p>
     <w:p>
       <w:pPr>
+        <w:keepNext/>
         <w:spacing w:before="120" w:after="120"/>
         <w:pBdr>
           <w:bottom w:val="single" w:sz="4" w:space="1" w:color="E5E7EB"/>
@@ -37,6 +39,7 @@
     </w:p>
     <w:p>
       <w:pPr>
+        <w:keepNext/>
         <w:spacing w:before="280" w:after="80"/>
       </w:pPr>
       <w:r>
@@ -230,6 +233,7 @@
     </w:p>
     <w:p>
       <w:pPr>
+        <w:keepNext/>
         <w:spacing w:before="120" w:after="120"/>
         <w:pBdr>
           <w:bottom w:val="single" w:sz="4" w:space="1" w:color="E5E7EB"/>
@@ -238,6 +242,7 @@
     </w:p>
     <w:p>
       <w:pPr>
+        <w:keepNext/>
         <w:spacing w:before="280" w:after="80"/>
       </w:pPr>
       <w:r>
@@ -411,6 +416,7 @@
     </w:p>
     <w:p>
       <w:pPr>
+        <w:keepNext/>
         <w:spacing w:before="120" w:after="120"/>
         <w:pBdr>
           <w:bottom w:val="single" w:sz="4" w:space="1" w:color="E5E7EB"/>
@@ -419,6 +425,7 @@
     </w:p>
     <w:p>
       <w:pPr>
+        <w:keepNext/>
         <w:spacing w:before="280" w:after="80"/>
       </w:pPr>
       <w:r>
@@ -442,7 +449,11 @@
         <w:t>All colors to be approved on pre-production lab dip before bulk. Pantone TCX references below.</w:t>
       </w:r>
     </w:p>
-    <w:p/>
+    <w:p>
+      <w:pPr>
+        <w:keepNext/>
+      </w:pPr>
+    </w:p>
     <w:tbl>
       <w:tblPr>
         <w:tblStyle w:val="TableGrid"/>
@@ -458,6 +469,9 @@
         <w:gridCol w:w="1994"/>
       </w:tblGrid>
       <w:tr>
+        <w:trPr>
+          <w:cantSplit/>
+        </w:trPr>
         <w:tc>
           <w:tcPr>
             <w:tcW w:type="dxa" w:w="1994"/>
@@ -560,6 +574,9 @@
         </w:tc>
       </w:tr>
       <w:tr>
+        <w:trPr>
+          <w:cantSplit/>
+        </w:trPr>
         <w:tc>
           <w:tcPr>
             <w:tcW w:type="dxa" w:w="1994"/>
@@ -653,6 +670,9 @@
         </w:tc>
       </w:tr>
       <w:tr>
+        <w:trPr>
+          <w:cantSplit/>
+        </w:trPr>
         <w:tc>
           <w:tcPr>
             <w:tcW w:type="dxa" w:w="1994"/>
@@ -746,6 +766,9 @@
         </w:tc>
       </w:tr>
       <w:tr>
+        <w:trPr>
+          <w:cantSplit/>
+        </w:trPr>
         <w:tc>
           <w:tcPr>
             <w:tcW w:type="dxa" w:w="1994"/>
@@ -839,6 +862,9 @@
         </w:tc>
       </w:tr>
       <w:tr>
+        <w:trPr>
+          <w:cantSplit/>
+        </w:trPr>
         <w:tc>
           <w:tcPr>
             <w:tcW w:type="dxa" w:w="1994"/>
@@ -932,6 +958,9 @@
         </w:tc>
       </w:tr>
       <w:tr>
+        <w:trPr>
+          <w:cantSplit/>
+        </w:trPr>
         <w:tc>
           <w:tcPr>
             <w:tcW w:type="dxa" w:w="1994"/>
@@ -1038,6 +1067,7 @@
     </w:p>
     <w:p>
       <w:pPr>
+        <w:keepNext/>
         <w:spacing w:before="120" w:after="120"/>
         <w:pBdr>
           <w:bottom w:val="single" w:sz="4" w:space="1" w:color="E5E7EB"/>
@@ -1046,6 +1076,7 @@
     </w:p>
     <w:p>
       <w:pPr>
+        <w:keepNext/>
         <w:spacing w:before="280" w:after="80"/>
       </w:pPr>
       <w:r>
@@ -1059,6 +1090,7 @@
     </w:p>
     <w:p>
       <w:pPr>
+        <w:keepNext/>
         <w:spacing w:before="160" w:after="40"/>
       </w:pPr>
       <w:r>
@@ -1152,6 +1184,7 @@
     </w:p>
     <w:p>
       <w:pPr>
+        <w:keepNext/>
         <w:spacing w:before="160" w:after="40"/>
       </w:pPr>
       <w:r>
@@ -1175,7 +1208,11 @@
         <w:t>All styles: Clean-bound neck finish — no rib band. Self-fabric tape, folded and stitched flat. Single needle topstitch 1/8" from edge, self-colour thread. Neck must lie flat against body without rolling or gaping. Reference: white tee reference image provided.</w:t>
       </w:r>
     </w:p>
-    <w:p/>
+    <w:p>
+      <w:pPr>
+        <w:keepNext/>
+      </w:pPr>
+    </w:p>
     <w:tbl>
       <w:tblPr>
         <w:tblStyle w:val="TableGrid"/>
@@ -1189,6 +1226,9 @@
         <w:gridCol w:w="3324"/>
       </w:tblGrid>
       <w:tr>
+        <w:trPr>
+          <w:cantSplit/>
+        </w:trPr>
         <w:tc>
           <w:tcPr>
             <w:tcW w:type="dxa" w:w="3324"/>
@@ -1251,6 +1291,9 @@
         </w:tc>
       </w:tr>
       <w:tr>
+        <w:trPr>
+          <w:cantSplit/>
+        </w:trPr>
         <w:tc>
           <w:tcPr>
             <w:tcW w:type="dxa" w:w="3324"/>
@@ -1308,6 +1351,9 @@
         </w:tc>
       </w:tr>
       <w:tr>
+        <w:trPr>
+          <w:cantSplit/>
+        </w:trPr>
         <w:tc>
           <w:tcPr>
             <w:tcW w:type="dxa" w:w="3324"/>
@@ -1365,6 +1411,9 @@
         </w:tc>
       </w:tr>
       <w:tr>
+        <w:trPr>
+          <w:cantSplit/>
+        </w:trPr>
         <w:tc>
           <w:tcPr>
             <w:tcW w:type="dxa" w:w="3324"/>
@@ -1424,6 +1473,7 @@
     </w:tbl>
     <w:p>
       <w:pPr>
+        <w:keepNext/>
         <w:spacing w:before="160" w:after="40"/>
       </w:pPr>
       <w:r>
@@ -1448,6 +1498,9 @@
         <w:gridCol w:w="3324"/>
       </w:tblGrid>
       <w:tr>
+        <w:trPr>
+          <w:cantSplit/>
+        </w:trPr>
         <w:tc>
           <w:tcPr>
             <w:tcW w:type="dxa" w:w="3324"/>
@@ -1510,6 +1563,9 @@
         </w:tc>
       </w:tr>
       <w:tr>
+        <w:trPr>
+          <w:cantSplit/>
+        </w:trPr>
         <w:tc>
           <w:tcPr>
             <w:tcW w:type="dxa" w:w="3324"/>
@@ -1567,6 +1623,9 @@
         </w:tc>
       </w:tr>
       <w:tr>
+        <w:trPr>
+          <w:cantSplit/>
+        </w:trPr>
         <w:tc>
           <w:tcPr>
             <w:tcW w:type="dxa" w:w="3324"/>
@@ -1624,6 +1683,9 @@
         </w:tc>
       </w:tr>
       <w:tr>
+        <w:trPr>
+          <w:cantSplit/>
+        </w:trPr>
         <w:tc>
           <w:tcPr>
             <w:tcW w:type="dxa" w:w="3324"/>
@@ -1683,6 +1745,7 @@
     </w:tbl>
     <w:p>
       <w:pPr>
+        <w:keepNext/>
         <w:spacing w:before="160" w:after="40"/>
       </w:pPr>
       <w:r>
@@ -1736,6 +1799,7 @@
     </w:p>
     <w:p>
       <w:pPr>
+        <w:keepNext/>
         <w:spacing w:before="120" w:after="120"/>
         <w:pBdr>
           <w:bottom w:val="single" w:sz="4" w:space="1" w:color="E5E7EB"/>
@@ -1744,6 +1808,7 @@
     </w:p>
     <w:p>
       <w:pPr>
+        <w:keepNext/>
         <w:spacing w:before="280" w:after="80"/>
       </w:pPr>
       <w:r>
@@ -1767,7 +1832,11 @@
         <w:t>All measurements in inches. Tolerance ±0.5" unless stated.</w:t>
       </w:r>
     </w:p>
-    <w:p/>
+    <w:p>
+      <w:pPr>
+        <w:keepNext/>
+      </w:pPr>
+    </w:p>
     <w:tbl>
       <w:tblPr>
         <w:tblStyle w:val="TableGrid"/>
@@ -1783,6 +1852,9 @@
         <w:gridCol w:w="1994"/>
       </w:tblGrid>
       <w:tr>
+        <w:trPr>
+          <w:cantSplit/>
+        </w:trPr>
         <w:tc>
           <w:tcPr>
             <w:tcW w:type="dxa" w:w="1994"/>
@@ -1885,6 +1957,9 @@
         </w:tc>
       </w:tr>
       <w:tr>
+        <w:trPr>
+          <w:cantSplit/>
+        </w:trPr>
         <w:tc>
           <w:tcPr>
             <w:tcW w:type="dxa" w:w="1994"/>
@@ -1978,6 +2053,9 @@
         </w:tc>
       </w:tr>
       <w:tr>
+        <w:trPr>
+          <w:cantSplit/>
+        </w:trPr>
         <w:tc>
           <w:tcPr>
             <w:tcW w:type="dxa" w:w="1994"/>
@@ -2071,6 +2149,9 @@
         </w:tc>
       </w:tr>
       <w:tr>
+        <w:trPr>
+          <w:cantSplit/>
+        </w:trPr>
         <w:tc>
           <w:tcPr>
             <w:tcW w:type="dxa" w:w="1994"/>
@@ -2164,6 +2245,9 @@
         </w:tc>
       </w:tr>
       <w:tr>
+        <w:trPr>
+          <w:cantSplit/>
+        </w:trPr>
         <w:tc>
           <w:tcPr>
             <w:tcW w:type="dxa" w:w="1994"/>
@@ -2257,6 +2341,9 @@
         </w:tc>
       </w:tr>
       <w:tr>
+        <w:trPr>
+          <w:cantSplit/>
+        </w:trPr>
         <w:tc>
           <w:tcPr>
             <w:tcW w:type="dxa" w:w="1994"/>
@@ -2350,6 +2437,9 @@
         </w:tc>
       </w:tr>
       <w:tr>
+        <w:trPr>
+          <w:cantSplit/>
+        </w:trPr>
         <w:tc>
           <w:tcPr>
             <w:tcW w:type="dxa" w:w="1994"/>
@@ -2443,6 +2533,9 @@
         </w:tc>
       </w:tr>
       <w:tr>
+        <w:trPr>
+          <w:cantSplit/>
+        </w:trPr>
         <w:tc>
           <w:tcPr>
             <w:tcW w:type="dxa" w:w="1994"/>
@@ -2536,6 +2629,9 @@
         </w:tc>
       </w:tr>
       <w:tr>
+        <w:trPr>
+          <w:cantSplit/>
+        </w:trPr>
         <w:tc>
           <w:tcPr>
             <w:tcW w:type="dxa" w:w="1994"/>
@@ -2631,6 +2727,7 @@
     </w:tbl>
     <w:p>
       <w:pPr>
+        <w:keepNext/>
         <w:spacing w:before="120" w:after="120"/>
         <w:pBdr>
           <w:bottom w:val="single" w:sz="4" w:space="1" w:color="E5E7EB"/>
@@ -2639,6 +2736,7 @@
     </w:p>
     <w:p>
       <w:pPr>
+        <w:keepNext/>
         <w:spacing w:before="280" w:after="80"/>
       </w:pPr>
       <w:r>
@@ -2653,6 +2751,7 @@
     <w:p/>
     <w:p>
       <w:pPr>
+        <w:keepNext/>
         <w:spacing w:before="160" w:after="40"/>
       </w:pPr>
       <w:r>
@@ -2679,6 +2778,9 @@
         <w:gridCol w:w="1994"/>
       </w:tblGrid>
       <w:tr>
+        <w:trPr>
+          <w:cantSplit/>
+        </w:trPr>
         <w:tc>
           <w:tcPr>
             <w:tcW w:type="dxa" w:w="1994"/>
@@ -2781,6 +2883,9 @@
         </w:tc>
       </w:tr>
       <w:tr>
+        <w:trPr>
+          <w:cantSplit/>
+        </w:trPr>
         <w:tc>
           <w:tcPr>
             <w:tcW w:type="dxa" w:w="1994"/>
@@ -2874,6 +2979,9 @@
         </w:tc>
       </w:tr>
       <w:tr>
+        <w:trPr>
+          <w:cantSplit/>
+        </w:trPr>
         <w:tc>
           <w:tcPr>
             <w:tcW w:type="dxa" w:w="1994"/>
@@ -2967,6 +3075,9 @@
         </w:tc>
       </w:tr>
       <w:tr>
+        <w:trPr>
+          <w:cantSplit/>
+        </w:trPr>
         <w:tc>
           <w:tcPr>
             <w:tcW w:type="dxa" w:w="1994"/>
@@ -3060,6 +3171,9 @@
         </w:tc>
       </w:tr>
       <w:tr>
+        <w:trPr>
+          <w:cantSplit/>
+        </w:trPr>
         <w:tc>
           <w:tcPr>
             <w:tcW w:type="dxa" w:w="1994"/>
@@ -3156,6 +3270,7 @@
     <w:p/>
     <w:p>
       <w:pPr>
+        <w:keepNext/>
         <w:spacing w:before="160" w:after="40"/>
       </w:pPr>
       <w:r>
@@ -3182,6 +3297,9 @@
         <w:gridCol w:w="1994"/>
       </w:tblGrid>
       <w:tr>
+        <w:trPr>
+          <w:cantSplit/>
+        </w:trPr>
         <w:tc>
           <w:tcPr>
             <w:tcW w:type="dxa" w:w="1994"/>
@@ -3284,6 +3402,9 @@
         </w:tc>
       </w:tr>
       <w:tr>
+        <w:trPr>
+          <w:cantSplit/>
+        </w:trPr>
         <w:tc>
           <w:tcPr>
             <w:tcW w:type="dxa" w:w="1994"/>
@@ -3377,6 +3498,9 @@
         </w:tc>
       </w:tr>
       <w:tr>
+        <w:trPr>
+          <w:cantSplit/>
+        </w:trPr>
         <w:tc>
           <w:tcPr>
             <w:tcW w:type="dxa" w:w="1994"/>
@@ -3470,6 +3594,9 @@
         </w:tc>
       </w:tr>
       <w:tr>
+        <w:trPr>
+          <w:cantSplit/>
+        </w:trPr>
         <w:tc>
           <w:tcPr>
             <w:tcW w:type="dxa" w:w="1994"/>
@@ -3563,6 +3690,9 @@
         </w:tc>
       </w:tr>
       <w:tr>
+        <w:trPr>
+          <w:cantSplit/>
+        </w:trPr>
         <w:tc>
           <w:tcPr>
             <w:tcW w:type="dxa" w:w="1994"/>
@@ -3659,6 +3789,7 @@
     <w:p/>
     <w:p>
       <w:pPr>
+        <w:keepNext/>
         <w:spacing w:before="160" w:after="40"/>
       </w:pPr>
       <w:r>
@@ -3685,6 +3816,9 @@
         <w:gridCol w:w="1994"/>
       </w:tblGrid>
       <w:tr>
+        <w:trPr>
+          <w:cantSplit/>
+        </w:trPr>
         <w:tc>
           <w:tcPr>
             <w:tcW w:type="dxa" w:w="1994"/>
@@ -3787,6 +3921,9 @@
         </w:tc>
       </w:tr>
       <w:tr>
+        <w:trPr>
+          <w:cantSplit/>
+        </w:trPr>
         <w:tc>
           <w:tcPr>
             <w:tcW w:type="dxa" w:w="1994"/>
@@ -3880,6 +4017,9 @@
         </w:tc>
       </w:tr>
       <w:tr>
+        <w:trPr>
+          <w:cantSplit/>
+        </w:trPr>
         <w:tc>
           <w:tcPr>
             <w:tcW w:type="dxa" w:w="1994"/>
@@ -3973,6 +4113,9 @@
         </w:tc>
       </w:tr>
       <w:tr>
+        <w:trPr>
+          <w:cantSplit/>
+        </w:trPr>
         <w:tc>
           <w:tcPr>
             <w:tcW w:type="dxa" w:w="1994"/>
@@ -4066,6 +4209,9 @@
         </w:tc>
       </w:tr>
       <w:tr>
+        <w:trPr>
+          <w:cantSplit/>
+        </w:trPr>
         <w:tc>
           <w:tcPr>
             <w:tcW w:type="dxa" w:w="1994"/>
@@ -4159,6 +4305,9 @@
         </w:tc>
       </w:tr>
       <w:tr>
+        <w:trPr>
+          <w:cantSplit/>
+        </w:trPr>
         <w:tc>
           <w:tcPr>
             <w:tcW w:type="dxa" w:w="1994"/>
@@ -4254,6 +4403,7 @@
     </w:tbl>
     <w:p>
       <w:pPr>
+        <w:keepNext/>
         <w:spacing w:before="120" w:after="120"/>
         <w:pBdr>
           <w:bottom w:val="single" w:sz="4" w:space="1" w:color="E5E7EB"/>
@@ -4262,6 +4412,7 @@
     </w:p>
     <w:p>
       <w:pPr>
+        <w:keepNext/>
         <w:spacing w:before="280" w:after="80"/>
       </w:pPr>
       <w:r>
@@ -4287,6 +4438,9 @@
         <w:gridCol w:w="2493"/>
       </w:tblGrid>
       <w:tr>
+        <w:trPr>
+          <w:cantSplit/>
+        </w:trPr>
         <w:tc>
           <w:tcPr>
             <w:tcW w:type="dxa" w:w="2493"/>
@@ -4369,6 +4523,9 @@
         </w:tc>
       </w:tr>
       <w:tr>
+        <w:trPr>
+          <w:cantSplit/>
+        </w:trPr>
         <w:tc>
           <w:tcPr>
             <w:tcW w:type="dxa" w:w="2493"/>
@@ -4444,6 +4601,9 @@
         </w:tc>
       </w:tr>
       <w:tr>
+        <w:trPr>
+          <w:cantSplit/>
+        </w:trPr>
         <w:tc>
           <w:tcPr>
             <w:tcW w:type="dxa" w:w="2493"/>
@@ -4519,6 +4679,9 @@
         </w:tc>
       </w:tr>
       <w:tr>
+        <w:trPr>
+          <w:cantSplit/>
+        </w:trPr>
         <w:tc>
           <w:tcPr>
             <w:tcW w:type="dxa" w:w="2493"/>
@@ -4594,6 +4757,9 @@
         </w:tc>
       </w:tr>
       <w:tr>
+        <w:trPr>
+          <w:cantSplit/>
+        </w:trPr>
         <w:tc>
           <w:tcPr>
             <w:tcW w:type="dxa" w:w="2493"/>
@@ -4683,6 +4849,7 @@
     </w:p>
     <w:p>
       <w:pPr>
+        <w:keepNext/>
         <w:spacing w:before="120" w:after="120"/>
         <w:pBdr>
           <w:bottom w:val="single" w:sz="4" w:space="1" w:color="E5E7EB"/>
@@ -4691,6 +4858,7 @@
     </w:p>
     <w:p>
       <w:pPr>
+        <w:keepNext/>
         <w:spacing w:before="280" w:after="80"/>
       </w:pPr>
       <w:r>
@@ -4704,6 +4872,7 @@
     </w:p>
     <w:p>
       <w:pPr>
+        <w:keepNext/>
         <w:spacing w:before="160" w:after="40"/>
       </w:pPr>
       <w:r>
@@ -4917,6 +5086,7 @@
     </w:p>
     <w:p>
       <w:pPr>
+        <w:keepNext/>
         <w:spacing w:before="160" w:after="40"/>
       </w:pPr>
       <w:r>
@@ -4990,6 +5160,7 @@
     </w:p>
     <w:p>
       <w:pPr>
+        <w:keepNext/>
         <w:spacing w:before="160" w:after="40"/>
       </w:pPr>
       <w:r>
@@ -5043,6 +5214,7 @@
     </w:p>
     <w:p>
       <w:pPr>
+        <w:keepNext/>
         <w:spacing w:before="120" w:after="120"/>
         <w:pBdr>
           <w:bottom w:val="single" w:sz="4" w:space="1" w:color="E5E7EB"/>
@@ -5051,6 +5223,7 @@
     </w:p>
     <w:p>
       <w:pPr>
+        <w:keepNext/>
         <w:spacing w:before="280" w:after="80"/>
       </w:pPr>
       <w:r>
@@ -5075,6 +5248,9 @@
         <w:gridCol w:w="3324"/>
       </w:tblGrid>
       <w:tr>
+        <w:trPr>
+          <w:cantSplit/>
+        </w:trPr>
         <w:tc>
           <w:tcPr>
             <w:tcW w:type="dxa" w:w="3324"/>
@@ -5137,6 +5313,9 @@
         </w:tc>
       </w:tr>
       <w:tr>
+        <w:trPr>
+          <w:cantSplit/>
+        </w:trPr>
         <w:tc>
           <w:tcPr>
             <w:tcW w:type="dxa" w:w="3324"/>
@@ -5194,6 +5373,9 @@
         </w:tc>
       </w:tr>
       <w:tr>
+        <w:trPr>
+          <w:cantSplit/>
+        </w:trPr>
         <w:tc>
           <w:tcPr>
             <w:tcW w:type="dxa" w:w="3324"/>
@@ -5251,6 +5433,9 @@
         </w:tc>
       </w:tr>
       <w:tr>
+        <w:trPr>
+          <w:cantSplit/>
+        </w:trPr>
         <w:tc>
           <w:tcPr>
             <w:tcW w:type="dxa" w:w="3324"/>
@@ -5308,6 +5493,9 @@
         </w:tc>
       </w:tr>
       <w:tr>
+        <w:trPr>
+          <w:cantSplit/>
+        </w:trPr>
         <w:tc>
           <w:tcPr>
             <w:tcW w:type="dxa" w:w="3324"/>
@@ -5387,6 +5575,7 @@
     </w:p>
     <w:p>
       <w:pPr>
+        <w:keepNext/>
         <w:spacing w:before="120" w:after="120"/>
         <w:pBdr>
           <w:bottom w:val="single" w:sz="4" w:space="1" w:color="E5E7EB"/>
@@ -5395,6 +5584,7 @@
     </w:p>
     <w:p>
       <w:pPr>
+        <w:keepNext/>
         <w:spacing w:before="280" w:after="80"/>
       </w:pPr>
       <w:r>
@@ -5548,6 +5738,7 @@
     </w:p>
     <w:p>
       <w:pPr>
+        <w:keepNext/>
         <w:spacing w:before="120" w:after="120"/>
         <w:pBdr>
           <w:bottom w:val="single" w:sz="4" w:space="1" w:color="E5E7EB"/>

</xml_diff>